<commit_message>
Leno: revisão Parte 3
Co-Authored-By: Claude Opus 5.5 <noreply@anthropic.com>
Claude-Session: https://claude.ai/code/session_01MJjUEEZrxQDEUifKK2vj9g
</commit_message>
<xml_diff>
--- a/roteiros/leno/Leno_Parte3.docx
+++ b/roteiros/leno/Leno_Parte3.docx
@@ -31,7 +31,7 @@
         <w:rPr>
           <w:color w:val="000000"/>
         </w:rPr>
-        <w:t>Os dois tinham escrito aquela letra juntos, nas mesmas semanas em que dividiam a sala da CBS.</w:t>
+        <w:t>Os dois tinham escrito aquela letra juntos, na época em que dividiam a sala da CBS.</w:t>
       </w:r>
     </w:p>
     <w:p>
@@ -215,7 +215,7 @@
         <w:rPr>
           <w:color w:val="1F4EB4"/>
         </w:rPr>
-        <w:t>Três meses de trabalho. A primeira letra de que Raul Seixas teve orgulho. O disco que Leno acreditava que ia mudar a música brasileira. Tudo ia desaparecer debaixo de outra música, como se nunca tivesse existido.</w:t>
+        <w:t>A primeira letra de que Raul Seixas teve orgulho ia desaparecer debaixo de outra gravação. O disco que Leno acreditava que ia mudar a música brasileira ia sumir como se nunca tivesse existido.</w:t>
       </w:r>
     </w:p>
     <w:p>
@@ -231,7 +231,7 @@
         <w:rPr>
           <w:color w:val="000000"/>
         </w:rPr>
-        <w:t>Para quem não lembra como funcionava um estúdio naquela época, é preciso explicar. A fita de rolo era cara. As gravadoras reaproveitavam. Apagar uma fita era uma decisão comum, quase burocrática.</w:t>
+        <w:t>Naquela época, fita de rolo era cara. As gravadoras costumavam reaproveitar as que consideravam sem valor.</w:t>
       </w:r>
     </w:p>
     <w:p>
@@ -295,7 +295,7 @@
         <w:rPr>
           <w:color w:val="000000"/>
         </w:rPr>
-        <w:t>O rapaz que a CBS tinha transformado em ídolo aos dezessete anos agora rompia com a gravadora aos vinte e dois.</w:t>
+        <w:t>O rapaz que a CBS tinha transformado em ídolo aos dezessete anos agora pedia para ir embora, aos vinte e dois.</w:t>
       </w:r>
     </w:p>
     <w:p>
@@ -463,7 +463,15 @@
         <w:rPr>
           <w:color w:val="000000"/>
         </w:rPr>
-        <w:t>Nesse meio tempo, chegou a refazer a dupla com Lílian. Os dois gravaram mais dois discos, em mil novecentos e setenta e dois e setenta e três. O sucesso antigo não voltou.</w:t>
+        <w:t>O homem que tinha produzido o disco dele virava lenda nas rádios. E Leno, que tinha bolado aquele disco inteiro, sumia das prateleiras.</w:t>
+      </w:r>
+    </w:p>
+    <w:p>
+      <w:r>
+        <w:rPr>
+          <w:color w:val="000000"/>
+        </w:rPr>
+        <w:t>Nesse meio tempo, voltou à mesma CBS para refazer a dupla com Lílian. Os dois gravaram mais dois discos, em mil novecentos e setenta e dois e setenta e três. O sucesso antigo não voltou.</w:t>
       </w:r>
     </w:p>
     <w:p>
@@ -479,7 +487,7 @@
         <w:rPr>
           <w:color w:val="000000"/>
         </w:rPr>
-        <w:t>O homem que tinha juntado os dois já não estava ali para segurar a dupla.</w:t>
+        <w:t>Renato Barros, que tinha juntado os dois, já não estava ali para segurar a dupla.</w:t>
       </w:r>
     </w:p>
     <w:p>
@@ -487,23 +495,7 @@
         <w:rPr>
           <w:color w:val="000000"/>
         </w:rPr>
-        <w:t>O homem que tinha produzido o disco dele virava lenda nas rádios. E Leno, que tinha bolado aquele disco inteiro, sumia das prateleiras.</w:t>
-      </w:r>
-    </w:p>
-    <w:p>
-      <w:r>
-        <w:rPr>
-          <w:color w:val="000000"/>
-        </w:rPr>
-        <w:t>Os dois foram se afastando.</w:t>
-      </w:r>
-    </w:p>
-    <w:p>
-      <w:r>
-        <w:rPr>
-          <w:color w:val="000000"/>
-        </w:rPr>
-        <w:t>Leno resumiu aquilo numa frase curta, sem drama nenhum.</w:t>
+        <w:t>Leno resumiu o que aconteceu entre ele e Raul numa frase curta, sem drama nenhum.</w:t>
       </w:r>
     </w:p>
     <w:p>
@@ -519,7 +511,7 @@
         <w:rPr>
           <w:color w:val="C00000"/>
         </w:rPr>
-        <w:t>Aqui é onde essa história fica ainda mais sombria. Porque o afastamento entre os dois esconde um detalhe que quase ninguém conhece. Um detalhe que liga Leno a algumas das músicas mais famosas que Raul Seixas gravou na vida.</w:t>
+        <w:t>E tem uma coisa que quase ninguém conectou até hoje. Esse afastamento esconde um detalhe. Um detalhe que liga Leno a algumas das músicas mais famosas que Raul Seixas gravou na vida.</w:t>
       </w:r>
     </w:p>
     <w:p>

</xml_diff>